<commit_message>
viz: citljivije pite i boxplot + osvezen izvestaj
- generisi_grafike.py: pite grupisu sitne kategorije u "ostalo", imena idu u
  legendu (ne kao labele na kriskama), procenat se pise samo >= 3% -> nema
  preklapanja (energetska klasa i cenovni opseg su bili necitljivi). Boxplot je
  sada horizontalan i sortiran po medijani (bio presirok/zgnjecen); uklonjen i
  deprecation `vert=` u korist `orientation=`.
- regenerisani svi grafici u izvestaj/grafici/.
- IZVESTAJ.docx: ugradjena cenovni-opseg pita zamenjena novom verzijom, uz
  korigovan odnos stranica da se ne razvuce (verifikovano renderom).

Co-Authored-By: Claude Opus 4.8 <noreply@anthropic.com>
</commit_message>
<xml_diff>
--- a/izvestaj/IZVESTAJ.docx
+++ b/izvestaj/IZVESTAJ.docx
@@ -1321,7 +1321,7 @@
       <w:r>
         <w:drawing>
           <wp:inline distT="0" distB="0" distL="0" distR="0">
-            <wp:extent cx="3429000" cy="3429000"/>
+            <wp:extent cx="4095750" cy="2657655"/>
             <wp:effectExtent t="0" r="0" b="0" l="0"/>
             <wp:docPr id="1" name="cenovni_opsezi_procenat.png" descr="cenovni_opsezi_procenat.png" title="cenovni_opsezi_procenat.png"/>
             <wp:cNvGraphicFramePr>
@@ -1346,7 +1346,7 @@
                   <pic:spPr bwMode="auto">
                     <a:xfrm>
                       <a:off x="0" y="0"/>
-                      <a:ext cx="3429000" cy="3429000"/>
+                      <a:ext cx="4095750" cy="2657655"/>
                     </a:xfrm>
                     <a:prstGeom prst="rect">
                       <a:avLst/>

</xml_diff>

<commit_message>
preporuke: tezinski faktori po tipu odlike (Z6)
Postavka trazi komentar o balansiranju odlika (da li cena ima veci
uticaj od brenda). Recommender sada mnozi svaki blok vektora tezinom:
tehnika 1.0, cena 0.9, naziv 0.7, brend 0.5 (blokovi se prvo skaliraju
na jedinicni intenzitet da velicina bloka ne bi odredjivala uticaj).
Izvestaj (md+docx) dopunjen objasnjenjem tezina i osvezenim primerima.
</commit_message>
<xml_diff>
--- a/izvestaj/IZVESTAJ.docx
+++ b/izvestaj/IZVESTAJ.docx
@@ -1193,7 +1193,7 @@
                 <w:bCs w:val="false"/>
                 <w:color w:val="000000"/>
               </w:rPr>
-              <w:t xml:space="preserve">min 1.039 / prosek 32.926 / max 120.999 RSD</w:t>
+              <w:t xml:space="preserve">min 1.039 / prosek 32.926 / max 120.992 RSD</w:t>
             </w:r>
           </w:p>
         </w:tc>
@@ -1880,6 +1880,106 @@
     </w:p>
     <w:p>
       <w:pPr>
+        <w:jc w:val="center"/>
+      </w:pPr>
+      <w:r>
+        <w:drawing>
+          <wp:inline xmlns:a="http://schemas.openxmlformats.org/drawingml/2006/main" xmlns:pic="http://schemas.openxmlformats.org/drawingml/2006/picture">
+            <wp:extent cx="5120640" cy="3200400"/>
+            <wp:docPr id="4" name="Picture 4"/>
+            <wp:cNvGraphicFramePr>
+              <a:graphicFrameLocks noChangeAspect="1"/>
+            </wp:cNvGraphicFramePr>
+            <a:graphic>
+              <a:graphicData uri="http://schemas.openxmlformats.org/drawingml/2006/picture">
+                <pic:pic>
+                  <pic:nvPicPr>
+                    <pic:cNvPr id="0" name="regresija_kriva_ucenja.png"/>
+                    <pic:cNvPicPr/>
+                  </pic:nvPicPr>
+                  <pic:blipFill>
+                    <a:blip r:embed="rId15"/>
+                    <a:stretch>
+                      <a:fillRect/>
+                    </a:stretch>
+                  </pic:blipFill>
+                  <pic:spPr>
+                    <a:xfrm>
+                      <a:off x="0" y="0"/>
+                      <a:ext cx="5120640" cy="3200400"/>
+                    </a:xfrm>
+                    <a:prstGeom prst="rect"/>
+                  </pic:spPr>
+                </pic:pic>
+              </a:graphicData>
+            </a:graphic>
+          </wp:inline>
+        </w:drawing>
+      </w:r>
+    </w:p>
+    <w:p>
+      <w:pPr>
+        <w:jc w:val="center"/>
+      </w:pPr>
+      <w:r>
+        <w:rPr>
+          <w:i/>
+        </w:rPr>
+        <w:t>Slika: Kriva ucenja — trosak (MSE, log skala) opada kroz 2000 iteracija gradijentnog spusta.</w:t>
+      </w:r>
+    </w:p>
+    <w:p>
+      <w:pPr>
+        <w:jc w:val="center"/>
+      </w:pPr>
+      <w:r>
+        <w:drawing>
+          <wp:inline xmlns:a="http://schemas.openxmlformats.org/drawingml/2006/main" xmlns:pic="http://schemas.openxmlformats.org/drawingml/2006/picture">
+            <wp:extent cx="5120640" cy="5120640"/>
+            <wp:docPr id="3" name="Picture 3"/>
+            <wp:cNvGraphicFramePr>
+              <a:graphicFrameLocks noChangeAspect="1"/>
+            </wp:cNvGraphicFramePr>
+            <a:graphic>
+              <a:graphicData uri="http://schemas.openxmlformats.org/drawingml/2006/picture">
+                <pic:pic>
+                  <pic:nvPicPr>
+                    <pic:cNvPr id="0" name="regresija_pred_vs_stvarno.png"/>
+                    <pic:cNvPicPr/>
+                  </pic:nvPicPr>
+                  <pic:blipFill>
+                    <a:blip r:embed="rId14"/>
+                    <a:stretch>
+                      <a:fillRect/>
+                    </a:stretch>
+                  </pic:blipFill>
+                  <pic:spPr>
+                    <a:xfrm>
+                      <a:off x="0" y="0"/>
+                      <a:ext cx="5120640" cy="5120640"/>
+                    </a:xfrm>
+                    <a:prstGeom prst="rect"/>
+                  </pic:spPr>
+                </pic:pic>
+              </a:graphicData>
+            </a:graphic>
+          </wp:inline>
+        </w:drawing>
+      </w:r>
+    </w:p>
+    <w:p>
+      <w:pPr>
+        <w:jc w:val="center"/>
+      </w:pPr>
+      <w:r>
+        <w:rPr>
+          <w:i/>
+        </w:rPr>
+        <w:t>Slika: Predvidjeno vs. stvarno na test skupu (idealna linija y=x, R²=0.55).</w:t>
+      </w:r>
+    </w:p>
+    <w:p>
+      <w:pPr>
         <w:pStyle w:val="Heading1"/>
         <w:pageBreakBefore/>
       </w:pPr>
@@ -2494,6 +2594,56 @@
     </w:p>
     <w:p>
       <w:pPr>
+        <w:jc w:val="center"/>
+      </w:pPr>
+      <w:r>
+        <w:drawing>
+          <wp:inline xmlns:a="http://schemas.openxmlformats.org/drawingml/2006/main" xmlns:pic="http://schemas.openxmlformats.org/drawingml/2006/picture">
+            <wp:extent cx="5120640" cy="3840480"/>
+            <wp:docPr id="2" name="Picture 2"/>
+            <wp:cNvGraphicFramePr>
+              <a:graphicFrameLocks noChangeAspect="1"/>
+            </wp:cNvGraphicFramePr>
+            <a:graphic>
+              <a:graphicData uri="http://schemas.openxmlformats.org/drawingml/2006/picture">
+                <pic:pic>
+                  <pic:nvPicPr>
+                    <pic:cNvPr id="0" name="klasteri_scatter.png"/>
+                    <pic:cNvPicPr/>
+                  </pic:nvPicPr>
+                  <pic:blipFill>
+                    <a:blip r:embed="rId13"/>
+                    <a:stretch>
+                      <a:fillRect/>
+                    </a:stretch>
+                  </pic:blipFill>
+                  <pic:spPr>
+                    <a:xfrm>
+                      <a:off x="0" y="0"/>
+                      <a:ext cx="5120640" cy="3840480"/>
+                    </a:xfrm>
+                    <a:prstGeom prst="rect"/>
+                  </pic:spPr>
+                </pic:pic>
+              </a:graphicData>
+            </a:graphic>
+          </wp:inline>
+        </w:drawing>
+      </w:r>
+    </w:p>
+    <w:p>
+      <w:pPr>
+        <w:jc w:val="center"/>
+      </w:pPr>
+      <w:r>
+        <w:rPr>
+          <w:i/>
+        </w:rPr>
+        <w:t>Slika: K-means klasteri (K=4) — cena 50% + zapremina 30% + energetska klasa 20%; X = centroidi.</w:t>
+      </w:r>
+    </w:p>
+    <w:p>
+      <w:pPr>
         <w:pStyle w:val="Heading1"/>
         <w:pageBreakBefore/>
       </w:pPr>
@@ -2506,7 +2656,63 @@
         <w:spacing w:after="120"/>
       </w:pPr>
       <w:r>
-        <w:t xml:space="preserve">Content-based sistem, ručna implementacija TF-IDF i kosinusne sličnosti. Feature vektor: numerički atributi (standardizovani) + brend (one-hot) + naziv (ručni TF-IDF). Preporučuje Top 5 iz iste kategorije.</w:t>
+        <w:t xml:space="preserve">Content-based sistem, ručna implementacija TF-IDF i kosinusne sličnosti. Feature vektor kombinuje četiri tipa odlika: cenu, tehničke specifikacije (standardizovane), brend (one-hot) i naziv (ručni TF-IDF). Preporučuje Top 5 iz iste kategorije.</w:t>
+      </w:r>
+    </w:p>
+    <w:p>
+      <w:pPr>
+        <w:pStyle w:val="Heading2"/>
+      </w:pPr>
+      <w:r>
+        <w:t xml:space="preserve">Težinsko balansiranje odlika</w:t>
+      </w:r>
+    </w:p>
+    <w:p>
+      <w:pPr>
+        <w:spacing w:after="120"/>
+      </w:pPr>
+      <w:r>
+        <w:t xml:space="preserve">Postavka traži da se prokomentariše kako su balansirane različite karakteristike (npr. da li cena ima veći uticaj od brenda). Različiti tipovi odlika nemaju isti uticaj na sličnost — svaki blok vektora se množi svojim težinskim faktorom pre računanja kosinusne sličnosti:</w:t>
+      </w:r>
+    </w:p>
+    <w:p>
+      <w:pPr>
+        <w:spacing w:after="120"/>
+      </w:pPr>
+      <w:r>
+        <w:t xml:space="preserve">• Tehničke specifikacije (težina 1,0) — suština sličnosti: proizvodi istih specifikacija (kapacitet, energetska klasa, dijagonala) su funkcionalno zamenljivi.</w:t>
+      </w:r>
+    </w:p>
+    <w:p>
+      <w:pPr>
+        <w:spacing w:after="120"/>
+      </w:pPr>
+      <w:r>
+        <w:t xml:space="preserve">• Cena (0,9) — drži isti cenovni segment, malo ispod tehnike jer korelira sa specifikacijama i ne sme da ih nadjača.</w:t>
+      </w:r>
+    </w:p>
+    <w:p>
+      <w:pPr>
+        <w:spacing w:after="120"/>
+      </w:pPr>
+      <w:r>
+        <w:t xml:space="preserve">• Naziv / TF-IDF (0,7) — hvata istu seriju/model; umeren da ne vraća samo duplikate istog modela.</w:t>
+      </w:r>
+    </w:p>
+    <w:p>
+      <w:pPr>
+        <w:spacing w:after="120"/>
+      </w:pPr>
+      <w:r>
+        <w:t xml:space="preserve">• Brend (0,5) — najniže namerno: za „slično“ želimo i alternative drugih brendova, ne kolaps na jednog proizvođača.</w:t>
+      </w:r>
+    </w:p>
+    <w:p>
+      <w:pPr>
+        <w:spacing w:after="120"/>
+      </w:pPr>
+      <w:r>
+        <w:t xml:space="preserve">Redosled uticaja: tehnika ≥ cena &gt; naziv &gt; brend. Dakle cena ima veći uticaj od brenda — kupcu je bliži proizvod sličnih performansi i cene nego proizvod istog brenda ali sasvim drugih karakteristika. Pre množenja težinama svaki blok se skalira na jedinični intenzitet, da veličina bloka (broj kolona) ne bi umesto težine određivala stvarni uticaj.</w:t>
       </w:r>
     </w:p>
     <w:p>
@@ -2784,7 +2990,7 @@
                 <w:bCs w:val="false"/>
                 <w:color w:val="000000"/>
               </w:rPr>
-              <w:t xml:space="preserve">0.993</w:t>
+              <w:t xml:space="preserve">0.988</w:t>
             </w:r>
           </w:p>
         </w:tc>
@@ -2813,7 +3019,7 @@
                 <w:bCs w:val="false"/>
                 <w:color w:val="000000"/>
               </w:rPr>
-              <w:t xml:space="preserve">Beko RCSA300K40WN</w:t>
+              <w:t xml:space="preserve">Beko RDSO206K40SN</w:t>
             </w:r>
           </w:p>
         </w:tc>
@@ -2840,7 +3046,7 @@
                 <w:bCs w:val="false"/>
                 <w:color w:val="000000"/>
               </w:rPr>
-              <w:t xml:space="preserve">32.661</w:t>
+              <w:t xml:space="preserve">24.741</w:t>
             </w:r>
           </w:p>
         </w:tc>
@@ -2867,7 +3073,7 @@
                 <w:bCs w:val="false"/>
                 <w:color w:val="000000"/>
               </w:rPr>
-              <w:t xml:space="preserve">0.603</w:t>
+              <w:t xml:space="preserve">0.815</w:t>
             </w:r>
           </w:p>
         </w:tc>
@@ -3027,7 +3233,7 @@
                 <w:bCs w:val="false"/>
                 <w:color w:val="000000"/>
               </w:rPr>
-              <w:t xml:space="preserve">Candy CSO286TWM6/1-S</w:t>
+              <w:t xml:space="preserve">Candy GD 27SB7-S</w:t>
             </w:r>
           </w:p>
         </w:tc>
@@ -3054,7 +3260,7 @@
                 <w:bCs w:val="false"/>
                 <w:color w:val="000000"/>
               </w:rPr>
-              <w:t xml:space="preserve">32.391</w:t>
+              <w:t xml:space="preserve">27.711</w:t>
             </w:r>
           </w:p>
         </w:tc>
@@ -3081,7 +3287,7 @@
                 <w:bCs w:val="false"/>
                 <w:color w:val="000000"/>
               </w:rPr>
-              <w:t xml:space="preserve">0.738</w:t>
+              <w:t xml:space="preserve">0.907</w:t>
             </w:r>
           </w:p>
         </w:tc>
@@ -3110,7 +3316,7 @@
                 <w:bCs w:val="false"/>
                 <w:color w:val="000000"/>
               </w:rPr>
-              <w:t xml:space="preserve">Candy CSO4474TWMB6/1-S</w:t>
+              <w:t xml:space="preserve">Candy GD 27SB7-S (drugi izvor)</w:t>
             </w:r>
           </w:p>
         </w:tc>
@@ -3137,7 +3343,7 @@
                 <w:bCs w:val="false"/>
                 <w:color w:val="000000"/>
               </w:rPr>
-              <w:t xml:space="preserve">31.844</w:t>
+              <w:t xml:space="preserve">29.999</w:t>
             </w:r>
           </w:p>
         </w:tc>
@@ -3164,7 +3370,7 @@
                 <w:bCs w:val="false"/>
                 <w:color w:val="000000"/>
               </w:rPr>
-              <w:t xml:space="preserve">0.730</w:t>
+              <w:t xml:space="preserve">0.903</w:t>
             </w:r>
           </w:p>
         </w:tc>
@@ -3193,7 +3399,7 @@
                 <w:bCs w:val="false"/>
                 <w:color w:val="000000"/>
               </w:rPr>
-              <w:t xml:space="preserve">Candy GD 27SB7-S</w:t>
+              <w:t xml:space="preserve">Candy CSO4474TWMB6/1-S</w:t>
             </w:r>
           </w:p>
         </w:tc>
@@ -3220,7 +3426,7 @@
                 <w:bCs w:val="false"/>
                 <w:color w:val="000000"/>
               </w:rPr>
-              <w:t xml:space="preserve">27.711</w:t>
+              <w:t xml:space="preserve">34.191</w:t>
             </w:r>
           </w:p>
         </w:tc>
@@ -3247,7 +3453,7 @@
                 <w:bCs w:val="false"/>
                 <w:color w:val="000000"/>
               </w:rPr>
-              <w:t xml:space="preserve">0.728</w:t>
+              <w:t xml:space="preserve">0.892</w:t>
             </w:r>
           </w:p>
         </w:tc>
@@ -3263,7 +3469,7 @@
         <w:spacing w:after="120"/>
       </w:pPr>
       <w:r>
-        <w:t xml:space="preserve">Težinsko balansiranje: isti brend i sličan naziv (TF-IDF) najviše utiču na sličnost, dok numerička bliskost cene fino rangira unutar brenda.</w:t>
+        <w:t xml:space="preserve">Zaključak: preporuke su proizvodi sličnih tehničkih karakteristika i cenovnog ranga, a ne puko poklapanje brenda — što je i cilj težinske šeme opisane iznad.</w:t>
       </w:r>
     </w:p>
     <w:p>

</xml_diff>